<commit_message>
update:cross-track integration & validation
</commit_message>
<xml_diff>
--- a/data/Track-specific Week 5 output - Initial ML Pipeline Implementation Packages.docx
+++ b/data/Track-specific Week 5 output - Initial ML Pipeline Implementation Packages.docx
@@ -16,7 +16,6 @@
           <w:u w:val="single"/>
         </w:rPr>
       </w:pPr>
-      <w:bookmarkStart w:id="0" w:name="_GoBack"/>
       <w:r>
         <w:rPr>
           <w:rFonts w:eastAsia="Times New Roman" w:cstheme="minorHAnsi"/>
@@ -29,7 +28,6 @@
         <w:t>Initial ML Pipeline Implementation Package - Track-specific Week 5 output</w:t>
       </w:r>
     </w:p>
-    <w:bookmarkEnd w:id="0"/>
     <w:p>
       <w:pPr>
         <w:spacing w:before="100" w:beforeAutospacing="1" w:after="100" w:afterAutospacing="1" w:line="240" w:lineRule="auto"/>
@@ -1773,6 +1771,70 @@
           <w:szCs w:val="24"/>
         </w:rPr>
         <w:t>Confusion matrix display → resolved by saving PNGs and showing inline in notebooks.</w:t>
+      </w:r>
+    </w:p>
+    <w:p>
+      <w:pPr>
+        <w:numPr>
+          <w:ilvl w:val="1"/>
+          <w:numId w:val="8"/>
+        </w:numPr>
+        <w:spacing w:before="100" w:beforeAutospacing="1" w:after="100" w:afterAutospacing="1" w:line="240" w:lineRule="auto"/>
+        <w:rPr>
+          <w:rFonts w:eastAsia="Times New Roman" w:cstheme="minorHAnsi"/>
+          <w:sz w:val="24"/>
+          <w:szCs w:val="24"/>
+        </w:rPr>
+      </w:pPr>
+      <w:proofErr w:type="gramStart"/>
+      <w:r>
+        <w:rPr>
+          <w:rStyle w:val="HTMLCode"/>
+          <w:rFonts w:eastAsiaTheme="minorHAnsi"/>
+        </w:rPr>
+        <w:t>appointments_clean.csv</w:t>
+      </w:r>
+      <w:proofErr w:type="gramEnd"/>
+      <w:r>
+        <w:t xml:space="preserve"> too large to push to GitHub.</w:t>
+      </w:r>
+      <w:r>
+        <w:t xml:space="preserve"> </w:t>
+      </w:r>
+      <w:proofErr w:type="spellStart"/>
+      <w:r>
+        <w:t>Resoved</w:t>
+      </w:r>
+      <w:proofErr w:type="spellEnd"/>
+      <w:r>
+        <w:t xml:space="preserve"> by adding</w:t>
+      </w:r>
+      <w:r>
+        <w:t xml:space="preserve"> to </w:t>
+      </w:r>
+      <w:r>
+        <w:rPr>
+          <w:rStyle w:val="HTMLCode"/>
+          <w:rFonts w:eastAsiaTheme="minorHAnsi"/>
+        </w:rPr>
+        <w:t>.</w:t>
+      </w:r>
+      <w:proofErr w:type="spellStart"/>
+      <w:r>
+        <w:rPr>
+          <w:rStyle w:val="HTMLCode"/>
+          <w:rFonts w:eastAsiaTheme="minorHAnsi"/>
+        </w:rPr>
+        <w:t>gitignore</w:t>
+      </w:r>
+      <w:proofErr w:type="spellEnd"/>
+      <w:r>
+        <w:t xml:space="preserve"> and documenting</w:t>
+      </w:r>
+      <w:bookmarkStart w:id="0" w:name="_GoBack"/>
+      <w:bookmarkEnd w:id="0"/>
+      <w:r>
+        <w:t xml:space="preserve"> external storage strategy.</w:t>
       </w:r>
     </w:p>
     <w:p>

</xml_diff>